<commit_message>
release: publish PasskeyTransit v0.2.0
</commit_message>
<xml_diff>
--- a/paper/current/PasskeyTransit_v0.2.docx
+++ b/paper/current/PasskeyTransit_v0.2.docx
@@ -33,7 +33,7 @@
     </w:p>
     <w:p>
       <w:r>
-        <w:t>Estudiamos si una passkey que continúa autenticando después de un intercambio conserva además su identidad, extensiones y garantías operacionales. Presentamos PasskeyTransit v0.2, un harness reproducible para CXF, CXP/HPKE, WebAuthn, mutaciones y fallos transaccionales. La campaña principal ejecutó 6,144 intentos sobre 256 credenciales, 12 rutas y dos repeticiones usando políticas de control y autenticadores virtuales Chromium. Las 6,144 aserciones WebAuthn fueron aceptadas, pero 2,944 intentos (47.92%; IC95% por bootstrap de credencial 43.03%-52.47%) combinaron login correcto con el fallo de otra propiedad aplicable. La preservación semántica completa observable fue 37.50% (2,304/6,144; IC95% 32.42%-42.77%). Estos porcentajes caracterizan estímulos sintéticos diseñados, no productos ni prevalencia real. PRF y preservación positiva de credBlob permanecen no evaluables por límites de la interfaz CDP.</w:t>
+        <w:t>Estudiamos si una passkey que continúa autenticando después de un intercambio conserva además su identidad, extensiones y garantías operacionales. Presentamos PasskeyTransit v0.2, un harness reproducible para CXF, CXP/HPKE, WebAuthn, mutaciones y fallos transaccionales. La campaña principal ejecutó 6,144 intentos sobre 256 credenciales, 12 rutas y dos repeticiones usando políticas de control y autenticadores virtuales Chromium. Las 6,144 aserciones WebAuthn fueron aceptadas, pero 2,944 intentos (47.92%; IC95% por bootstrap de credencial 43.42%-52.47%) combinaron login correcto con el fallo de otra propiedad aplicable. La preservación semántica completa observable fue 37.50% (2,304/6,144; IC95% 32.42%-42.58%). Estos porcentajes caracterizan estímulos sintéticos diseñados, no productos ni prevalencia real. PRF y preservación positiva de credBlob permanecen no evaluables por límites de la interfaz CDP.</w:t>
       </w:r>
     </w:p>
     <w:p>
@@ -464,7 +464,7 @@
     </w:p>
     <w:p>
       <w:r>
-        <w:t>La tasa de degradación silenciosa fue 31.25% (1,920/6,144; IC95% 28.84%-33.66%). largeBlob fue observable en 1.536 casos aplicables: 768 pasaron y 768 fallaron según la ruta de control. La pérdida en un intermediario persistió al volver a un destino capaz, produciendo discordancias en comparaciones pareadas con el mismo destino.</w:t>
+        <w:t>La tasa de degradación silenciosa fue 31.25% (1,920/6,144; IC95% 28.78%-33.66%). largeBlob fue observable en 1.536 casos aplicables: 768 pasaron y 768 fallaron según la ruta de control. La pérdida en un intermediario persistió al volver a un destino capaz, produciendo discordancias en comparaciones pareadas con el mismo destino.</w:t>
       </w:r>
     </w:p>
     <w:p>
@@ -1065,7 +1065,7 @@
       <w:spacing w:after="120" w:line="259" w:lineRule="auto"/>
     </w:pPr>
     <w:rPr>
-      <w:rFonts w:ascii="Arial" w:hAnsi="Arial"/>
+      <w:rFonts w:ascii="Arial" w:hAnsi="Arial" w:eastAsia="Arial" w:cs="Arial"/>
       <w:color w:val="000000"/>
       <w:sz w:val="21"/>
     </w:rPr>
@@ -1129,7 +1129,7 @@
       <w:outlineLvl w:val="0"/>
     </w:pPr>
     <w:rPr>
-      <w:rFonts w:asciiTheme="majorHAnsi" w:eastAsiaTheme="majorEastAsia" w:hAnsiTheme="majorHAnsi" w:cstheme="majorBidi" w:ascii="Arial" w:hAnsi="Arial"/>
+      <w:rFonts w:asciiTheme="majorHAnsi" w:eastAsiaTheme="majorEastAsia" w:hAnsiTheme="majorHAnsi" w:cstheme="majorBidi" w:ascii="Arial" w:hAnsi="Arial" w:eastAsia="Arial" w:cs="Arial"/>
       <w:b/>
       <w:bCs/>
       <w:color w:val="000000"/>
@@ -1153,7 +1153,7 @@
       <w:outlineLvl w:val="1"/>
     </w:pPr>
     <w:rPr>
-      <w:rFonts w:asciiTheme="majorHAnsi" w:eastAsiaTheme="majorEastAsia" w:hAnsiTheme="majorHAnsi" w:cstheme="majorBidi" w:ascii="Arial" w:hAnsi="Arial"/>
+      <w:rFonts w:asciiTheme="majorHAnsi" w:eastAsiaTheme="majorEastAsia" w:hAnsiTheme="majorHAnsi" w:cstheme="majorBidi" w:ascii="Arial" w:hAnsi="Arial" w:eastAsia="Arial" w:cs="Arial"/>
       <w:b/>
       <w:bCs/>
       <w:color w:val="000000"/>
@@ -1415,7 +1415,7 @@
       <w:contextualSpacing/>
     </w:pPr>
     <w:rPr>
-      <w:rFonts w:asciiTheme="majorHAnsi" w:eastAsiaTheme="majorEastAsia" w:hAnsiTheme="majorHAnsi" w:cstheme="majorBidi" w:ascii="Arial" w:hAnsi="Arial"/>
+      <w:rFonts w:asciiTheme="majorHAnsi" w:eastAsiaTheme="majorEastAsia" w:hAnsiTheme="majorHAnsi" w:cstheme="majorBidi" w:ascii="Arial" w:hAnsi="Arial" w:eastAsia="Arial" w:cs="Arial"/>
       <w:color w:val="000000"/>
       <w:spacing w:val="5"/>
       <w:kern w:val="28"/>

</xml_diff>